<commit_message>
M3 CJCE: AI declaration moved to Methods 4.4; LaTeX bundle for Main Manuscript; highlights <=85 chars
</commit_message>
<xml_diff>
--- a/paper2/cjce/Highlights_Most_Relevant_Contributions.docx
+++ b/paper2/cjce/Highlights_Most_Relevant_Contributions.docx
@@ -44,7 +44,7 @@
         <w:spacing w:after="120"/>
       </w:pPr>
       <w:r>
-        <w:t xml:space="preserve">Six distribution-free back-offs compared on a rigorous DWSIM debutanizer twin over 1000 trials.</w:t>
+        <w:t xml:space="preserve">Six distribution-free back-offs compared on a rigorous DWSIM debutanizer twin</w:t>
       </w:r>
     </w:p>
     <w:p>
@@ -57,7 +57,7 @@
         <w:spacing w:after="120"/>
       </w:pPr>
       <w:r>
-        <w:t xml:space="preserve">Back-offs valid on average deployed unsafe setpoints in 67.5% to 100% of trials.</w:t>
+        <w:t xml:space="preserve">Back-offs valid on average deployed unsafe setpoints in 67.5% to 100% of trials</w:t>
       </w:r>
     </w:p>
     <w:p>
@@ -70,7 +70,7 @@
         <w:spacing w:after="120"/>
       </w:pPr>
       <w:r>
-        <w:t xml:space="preserve">Certify-then-deploy and sampling-and-discarding kept unsafe deployments at or below 2.5%.</w:t>
+        <w:t xml:space="preserve">Certification and scenario discarding kept unsafe deployments at or below 2.5%</w:t>
       </w:r>
     </w:p>
     <w:p>
@@ -83,7 +83,7 @@
         <w:spacing w:after="120"/>
       </w:pPr>
       <w:r>
-        <w:t xml:space="preserve">Unguaranteed back-offs lose money once off-spec bottoms cost more than 0.017 to 0.032 USD/kg.</w:t>
+        <w:t xml:space="preserve">Naive back-offs lose money once off-spec bottoms cost over 0.017 to 0.032 USD/kg</w:t>
       </w:r>
     </w:p>
     <w:p>
@@ -96,7 +96,7 @@
         <w:spacing w:after="120"/>
       </w:pPr>
       <w:r>
-        <w:t xml:space="preserve">Selection rule: plant model inside the optimizer, discard; nominal model only, certify.</w:t>
+        <w:t xml:space="preserve">Rule: if the plant model fits inside the optimizer, discard; if not, certify</w:t>
       </w:r>
     </w:p>
     <w:sectPr>

</xml_diff>